<commit_message>
feat: improve OpenCyberPath learning and weekly resource maintenance
</commit_message>
<xml_diff>
--- a/website/public/notes/bug-bounty-http-observation-lab.docx
+++ b/website/public/notes/bug-bounty-http-observation-lab.docx
@@ -1211,6 +1211,1224 @@
         <w:spacing w:after="0"/>
       </w:pPr>
     </w:p>
+    <w:p>
+      <w:pPr>
+        <w:pageBreakBefore/>
+        <w:spacing w:before="0" w:after="20" w:line="240" w:lineRule="auto"/>
+        <w:jc w:val="right"/>
+      </w:pPr>
+      <w:r>
+        <w:rPr>
+          <w:rFonts w:ascii="Comic Neue" w:hAnsi="Comic Neue" w:eastAsia="Comic Neue"/>
+          <w:b/>
+          <w:i/>
+          <w:color w:val="688097"/>
+          <w:sz w:val="15"/>
+        </w:rPr>
+        <w:t>OPENCYBERPATH FIELD NOTEBOOK - MATCHED EXTERNAL PRACTICE</w:t>
+      </w:r>
+    </w:p>
+    <w:p>
+      <w:pPr>
+        <w:keepNext/>
+        <w:spacing w:before="100" w:after="80" w:line="240" w:lineRule="auto"/>
+      </w:pPr>
+      <w:r>
+        <w:rPr>
+          <w:rFonts w:ascii="Comic Neue" w:hAnsi="Comic Neue" w:eastAsia="Comic Neue"/>
+          <w:b/>
+          <w:i/>
+          <w:color w:val="087F8C"/>
+          <w:sz w:val="34"/>
+        </w:rPr>
+        <w:t>A real lab for these notes</w:t>
+      </w:r>
+    </w:p>
+    <w:p>
+      <w:pPr>
+        <w:spacing w:before="0" w:after="80" w:line="240" w:lineRule="auto"/>
+      </w:pPr>
+      <w:r>
+        <w:rPr>
+          <w:rFonts w:ascii="Comic Neue" w:hAnsi="Comic Neue" w:eastAsia="Comic Neue"/>
+          <w:b w:val="0"/>
+          <w:i w:val="0"/>
+          <w:color w:val="24344D"/>
+          <w:sz w:val="20"/>
+        </w:rPr>
+        <w:t>Topic: HTTP methods, status codes, headers, body, and safe observation. These pages connect the existing OpenCyberPath notes to specific provider-hosted exercises. The card label is intentionally generic; the exact task name and direct URL are listed here so you can open the right exercise instead of a whole catalogue.</w:t>
+      </w:r>
+    </w:p>
+    <w:p>
+      <w:pPr>
+        <w:keepNext/>
+        <w:spacing w:before="40" w:after="80" w:line="240" w:lineRule="auto"/>
+      </w:pPr>
+      <w:r>
+        <w:rPr>
+          <w:rFonts w:ascii="Comic Neue" w:hAnsi="Comic Neue" w:eastAsia="Comic Neue"/>
+          <w:b/>
+          <w:i/>
+          <w:color w:val="B34778"/>
+          <w:sz w:val="25"/>
+        </w:rPr>
+        <w:t>Concept checkpoints</w:t>
+      </w:r>
+    </w:p>
+    <w:p>
+      <w:pPr>
+        <w:pStyle w:val="ListBullet"/>
+        <w:spacing w:before="0" w:after="40" w:line="240" w:lineRule="auto"/>
+      </w:pPr>
+      <w:r>
+        <w:rPr>
+          <w:rFonts w:ascii="Comic Neue" w:hAnsi="Comic Neue" w:eastAsia="Comic Neue"/>
+          <w:b w:val="0"/>
+          <w:i w:val="0"/>
+          <w:color w:val="283A50"/>
+          <w:sz w:val="19"/>
+        </w:rPr>
+        <w:t>Request: method, path, host, headers, and optional body. Response: status, headers, and content.</w:t>
+      </w:r>
+    </w:p>
+    <w:p>
+      <w:pPr>
+        <w:pStyle w:val="ListBullet"/>
+        <w:spacing w:before="0" w:after="40" w:line="240" w:lineRule="auto"/>
+      </w:pPr>
+      <w:r>
+        <w:rPr>
+          <w:rFonts w:ascii="Comic Neue" w:hAnsi="Comic Neue" w:eastAsia="Comic Neue"/>
+          <w:b w:val="0"/>
+          <w:i w:val="0"/>
+          <w:color w:val="283A50"/>
+          <w:sz w:val="19"/>
+        </w:rPr>
+        <w:t>HTTP 200 indicates a successful response, 302 a redirect, 401 unauthenticated, 403 forbidden, and 404 not found; application context matters.</w:t>
+      </w:r>
+    </w:p>
+    <w:p>
+      <w:pPr>
+        <w:pStyle w:val="ListBullet"/>
+        <w:spacing w:before="0" w:after="40" w:line="240" w:lineRule="auto"/>
+      </w:pPr>
+      <w:r>
+        <w:rPr>
+          <w:rFonts w:ascii="Comic Neue" w:hAnsi="Comic Neue" w:eastAsia="Comic Neue"/>
+          <w:b w:val="0"/>
+          <w:i w:val="0"/>
+          <w:color w:val="283A50"/>
+          <w:sz w:val="19"/>
+        </w:rPr>
+        <w:t>HTTPS encrypts transport; the browser still displays status and response metadata.</w:t>
+      </w:r>
+    </w:p>
+    <w:p>
+      <w:pPr>
+        <w:pStyle w:val="ListBullet"/>
+        <w:spacing w:before="0" w:after="40" w:line="240" w:lineRule="auto"/>
+      </w:pPr>
+      <w:r>
+        <w:rPr>
+          <w:rFonts w:ascii="Comic Neue" w:hAnsi="Comic Neue" w:eastAsia="Comic Neue"/>
+          <w:b w:val="0"/>
+          <w:i w:val="0"/>
+          <w:color w:val="283A50"/>
+          <w:sz w:val="19"/>
+        </w:rPr>
+        <w:t>Capture the exact timestamp and lab hostname but redact cookies and authorization headers.</w:t>
+      </w:r>
+    </w:p>
+    <w:p>
+      <w:pPr>
+        <w:keepNext/>
+        <w:spacing w:before="0" w:after="0" w:line="240" w:lineRule="auto"/>
+      </w:pPr>
+      <w:r>
+        <w:rPr>
+          <w:rFonts w:ascii="Comic Neue" w:hAnsi="Comic Neue" w:eastAsia="Comic Neue"/>
+          <w:b/>
+          <w:i w:val="0"/>
+          <w:color w:val="213A58"/>
+          <w:sz w:val="20"/>
+        </w:rPr>
+        <w:t xml:space="preserve">HTTP in Detail  </w:t>
+      </w:r>
+      <w:r>
+        <w:rPr>
+          <w:rFonts w:ascii="Comic Neue" w:hAnsi="Comic Neue" w:eastAsia="Comic Neue"/>
+          <w:b w:val="0"/>
+          <w:i/>
+          <w:color w:val="007B89"/>
+          <w:sz w:val="17"/>
+        </w:rPr>
+        <w:t>[TryHackMe]</w:t>
+      </w:r>
+    </w:p>
+    <w:p>
+      <w:pPr>
+        <w:spacing w:before="0" w:after="20" w:line="240" w:lineRule="auto"/>
+      </w:pPr>
+      <w:hyperlink r:id="rId14">
+        <w:r>
+          <w:rPr>
+            <w:color w:val="1465A8"/>
+            <w:u w:val="single"/>
+            <w:rFonts w:ascii="DejaVu Sans Mono" w:hAnsi="DejaVu Sans Mono" w:eastAsia="DejaVu Sans Mono"/>
+            <w:sz w:val="15"/>
+          </w:rPr>
+          <w:t>https://tryhackme.com/room/httpindetail</w:t>
+        </w:r>
+      </w:hyperlink>
+    </w:p>
+    <w:p>
+      <w:pPr>
+        <w:spacing w:before="0" w:after="60" w:line="240" w:lineRule="auto"/>
+      </w:pPr>
+      <w:r>
+        <w:rPr>
+          <w:rFonts w:ascii="Comic Neue" w:hAnsi="Comic Neue" w:eastAsia="Comic Neue"/>
+          <w:b w:val="0"/>
+          <w:i/>
+          <w:color w:val="5E6D7E"/>
+          <w:sz w:val="17"/>
+        </w:rPr>
+        <w:t>Access note: Account required; the page uses a website exercise and interactive questions. Confirm current room availability before starting.</w:t>
+      </w:r>
+    </w:p>
+    <w:p>
+      <w:pPr>
+        <w:keepNext/>
+        <w:spacing w:before="0" w:after="0" w:line="240" w:lineRule="auto"/>
+      </w:pPr>
+      <w:r>
+        <w:rPr>
+          <w:rFonts w:ascii="Comic Neue" w:hAnsi="Comic Neue" w:eastAsia="Comic Neue"/>
+          <w:b/>
+          <w:i w:val="0"/>
+          <w:color w:val="213A58"/>
+          <w:sz w:val="20"/>
+        </w:rPr>
+        <w:t xml:space="preserve">Wireshark: The Basics  </w:t>
+      </w:r>
+      <w:r>
+        <w:rPr>
+          <w:rFonts w:ascii="Comic Neue" w:hAnsi="Comic Neue" w:eastAsia="Comic Neue"/>
+          <w:b w:val="0"/>
+          <w:i/>
+          <w:color w:val="007B89"/>
+          <w:sz w:val="17"/>
+        </w:rPr>
+        <w:t>[TryHackMe]</w:t>
+      </w:r>
+    </w:p>
+    <w:p>
+      <w:pPr>
+        <w:spacing w:before="0" w:after="20" w:line="240" w:lineRule="auto"/>
+      </w:pPr>
+      <w:hyperlink r:id="rId15">
+        <w:r>
+          <w:rPr>
+            <w:color w:val="1465A8"/>
+            <w:u w:val="single"/>
+            <w:rFonts w:ascii="DejaVu Sans Mono" w:hAnsi="DejaVu Sans Mono" w:eastAsia="DejaVu Sans Mono"/>
+            <w:sz w:val="15"/>
+          </w:rPr>
+          <w:t>https://tryhackme.com/room/wiresharkthebasics</w:t>
+        </w:r>
+      </w:hyperlink>
+    </w:p>
+    <w:p>
+      <w:pPr>
+        <w:spacing w:before="0" w:after="60" w:line="240" w:lineRule="auto"/>
+      </w:pPr>
+      <w:r>
+        <w:rPr>
+          <w:rFonts w:ascii="Comic Neue" w:hAnsi="Comic Neue" w:eastAsia="Comic Neue"/>
+          <w:b w:val="0"/>
+          <w:i/>
+          <w:color w:val="5E6D7E"/>
+          <w:sz w:val="17"/>
+        </w:rPr>
+        <w:t>Access note: Account required; a deployable machine and practice PCAP are described on the page. Some tasks may require a paid entitlement.</w:t>
+      </w:r>
+    </w:p>
+    <w:tbl>
+      <w:tblPr>
+        <w:tblW w:type="auto" w:w="0"/>
+        <w:jc w:val="center"/>
+        <w:tblLayout w:type="autofit"/>
+        <w:tblLook w:firstColumn="1" w:firstRow="1" w:lastColumn="0" w:lastRow="0" w:noHBand="0" w:noVBand="1" w:val="04A0"/>
+      </w:tblPr>
+      <w:tblGrid>
+        <w:gridCol w:w="10108"/>
+      </w:tblGrid>
+      <w:tr>
+        <w:tc>
+          <w:tcPr>
+            <w:tcW w:type="dxa" w:w="10108"/>
+            <w:shd w:fill="DDF4F2"/>
+            <w:tcMar>
+              <w:top w:w="90" w:type="dxa"/>
+              <w:start w:w="150" w:type="dxa"/>
+              <w:bottom w:w="90" w:type="dxa"/>
+              <w:end w:w="150" w:type="dxa"/>
+            </w:tcMar>
+          </w:tcPr>
+          <w:p>
+            <w:pPr>
+              <w:spacing w:before="0" w:after="0" w:line="240" w:lineRule="auto"/>
+            </w:pPr>
+            <w:r>
+              <w:rPr>
+                <w:rFonts w:ascii="Comic Neue" w:hAnsi="Comic Neue" w:eastAsia="Comic Neue"/>
+                <w:b/>
+                <w:i/>
+                <w:color w:val="087F8C"/>
+                <w:sz w:val="18"/>
+              </w:rPr>
+              <w:t xml:space="preserve">ACCESS CHECK  </w:t>
+            </w:r>
+            <w:r>
+              <w:rPr>
+                <w:rFonts w:ascii="Comic Neue" w:hAnsi="Comic Neue" w:eastAsia="Comic Neue"/>
+                <w:b w:val="0"/>
+                <w:i w:val="0"/>
+                <w:color w:val="2F3E50"/>
+                <w:sz w:val="18"/>
+              </w:rPr>
+              <w:t>Open the exact task page and verify the current login, account tier, VM launch button, free/paid terms, and any cost notes before starting. A provider may change availability or retire a challenge.</w:t>
+            </w:r>
+          </w:p>
+        </w:tc>
+      </w:tr>
+    </w:tbl>
+    <w:p>
+      <w:pPr>
+        <w:spacing w:after="0"/>
+      </w:pPr>
+    </w:p>
+    <w:p>
+      <w:pPr>
+        <w:keepNext/>
+        <w:spacing w:before="40" w:after="80" w:line="240" w:lineRule="auto"/>
+      </w:pPr>
+      <w:r>
+        <w:rPr>
+          <w:rFonts w:ascii="Comic Neue" w:hAnsi="Comic Neue" w:eastAsia="Comic Neue"/>
+          <w:b/>
+          <w:i/>
+          <w:color w:val="B34778"/>
+          <w:sz w:val="25"/>
+        </w:rPr>
+        <w:t>Before you click Start</w:t>
+      </w:r>
+    </w:p>
+    <w:p>
+      <w:pPr>
+        <w:pStyle w:val="ListBullet"/>
+        <w:spacing w:before="0" w:after="40" w:line="240" w:lineRule="auto"/>
+      </w:pPr>
+      <w:r>
+        <w:rPr>
+          <w:rFonts w:ascii="Comic Neue" w:hAnsi="Comic Neue" w:eastAsia="Comic Neue"/>
+          <w:b w:val="0"/>
+          <w:i w:val="0"/>
+          <w:color w:val="283A50"/>
+          <w:sz w:val="19"/>
+        </w:rPr>
+        <w:t>Write down the provider’s target/scope and use only the instance it creates for you.</w:t>
+      </w:r>
+    </w:p>
+    <w:p>
+      <w:pPr>
+        <w:pStyle w:val="ListBullet"/>
+        <w:spacing w:before="0" w:after="40" w:line="240" w:lineRule="auto"/>
+      </w:pPr>
+      <w:r>
+        <w:rPr>
+          <w:rFonts w:ascii="Comic Neue" w:hAnsi="Comic Neue" w:eastAsia="Comic Neue"/>
+          <w:b w:val="0"/>
+          <w:i w:val="0"/>
+          <w:color w:val="283A50"/>
+          <w:sz w:val="19"/>
+        </w:rPr>
+        <w:t>Keep this notebook beside the exercise. Use its original course data before trying commands on a local machine.</w:t>
+      </w:r>
+    </w:p>
+    <w:p>
+      <w:pPr>
+        <w:pStyle w:val="ListBullet"/>
+        <w:spacing w:before="0" w:after="40" w:line="240" w:lineRule="auto"/>
+      </w:pPr>
+      <w:r>
+        <w:rPr>
+          <w:rFonts w:ascii="Comic Neue" w:hAnsi="Comic Neue" w:eastAsia="Comic Neue"/>
+          <w:b w:val="0"/>
+          <w:i w:val="0"/>
+          <w:color w:val="283A50"/>
+          <w:sz w:val="19"/>
+        </w:rPr>
+        <w:t>Capture timestamps, filenames, row/packet IDs, and a short explanation; redact credentials, tokens, and personal data.</w:t>
+      </w:r>
+    </w:p>
+    <w:p>
+      <w:pPr>
+        <w:pStyle w:val="ListBullet"/>
+        <w:spacing w:before="0" w:after="40" w:line="240" w:lineRule="auto"/>
+      </w:pPr>
+      <w:r>
+        <w:rPr>
+          <w:rFonts w:ascii="Comic Neue" w:hAnsi="Comic Neue" w:eastAsia="Comic Neue"/>
+          <w:b w:val="0"/>
+          <w:i w:val="0"/>
+          <w:color w:val="283A50"/>
+          <w:sz w:val="19"/>
+        </w:rPr>
+        <w:t>If a page says retired, premium, or downloadable-only, use the alternative listed in the access note or return to the matching interactive lab above.</w:t>
+      </w:r>
+    </w:p>
+    <w:p>
+      <w:pPr>
+        <w:pageBreakBefore/>
+        <w:spacing w:before="0" w:after="20" w:line="240" w:lineRule="auto"/>
+        <w:jc w:val="right"/>
+      </w:pPr>
+      <w:r>
+        <w:rPr>
+          <w:rFonts w:ascii="Comic Neue" w:hAnsi="Comic Neue" w:eastAsia="Comic Neue"/>
+          <w:b/>
+          <w:i/>
+          <w:color w:val="688097"/>
+          <w:sz w:val="15"/>
+        </w:rPr>
+        <w:t>COMMAND NOTEBOOK - COPY ONE LINE AT A TIME</w:t>
+      </w:r>
+    </w:p>
+    <w:p>
+      <w:pPr>
+        <w:keepNext/>
+        <w:spacing w:before="100" w:after="80" w:line="240" w:lineRule="auto"/>
+      </w:pPr>
+      <w:r>
+        <w:rPr>
+          <w:rFonts w:ascii="Comic Neue" w:hAnsi="Comic Neue" w:eastAsia="Comic Neue"/>
+          <w:b/>
+          <w:i/>
+          <w:color w:val="087F8C"/>
+          <w:sz w:val="34"/>
+        </w:rPr>
+        <w:t>Commands you can explain</w:t>
+      </w:r>
+    </w:p>
+    <w:p>
+      <w:pPr>
+        <w:spacing w:before="0" w:after="80" w:line="240" w:lineRule="auto"/>
+      </w:pPr>
+      <w:r>
+        <w:rPr>
+          <w:rFonts w:ascii="Comic Neue" w:hAnsi="Comic Neue" w:eastAsia="Comic Neue"/>
+          <w:b/>
+          <w:i w:val="0"/>
+          <w:color w:val="8B4E24"/>
+          <w:sz w:val="19"/>
+        </w:rPr>
+        <w:t>The placeholder hostname must be replaced only by your generated training instance. Never run verbose HTTP commands against targets outside the permitted lab scope.</w:t>
+      </w:r>
+    </w:p>
+    <w:p>
+      <w:pPr>
+        <w:spacing w:before="0" w:after="100" w:line="240" w:lineRule="auto"/>
+      </w:pPr>
+      <w:r>
+        <w:rPr>
+          <w:rFonts w:ascii="Comic Neue" w:hAnsi="Comic Neue" w:eastAsia="Comic Neue"/>
+          <w:b w:val="0"/>
+          <w:i/>
+          <w:color w:val="5A6C7E"/>
+          <w:sz w:val="18"/>
+        </w:rPr>
+        <w:t>First download the matching sample file(s) from the existing card when a command names one. Keep the data in a practice folder and never execute strings stored in evidence.</w:t>
+      </w:r>
+    </w:p>
+    <w:p>
+      <w:pPr>
+        <w:keepNext/>
+        <w:spacing w:before="60" w:after="0" w:line="240" w:lineRule="auto"/>
+      </w:pPr>
+      <w:r>
+        <w:rPr>
+          <w:rFonts w:ascii="Comic Neue" w:hAnsi="Comic Neue" w:eastAsia="Comic Neue"/>
+          <w:b/>
+          <w:i w:val="0"/>
+          <w:color w:val="007B89"/>
+          <w:sz w:val="16"/>
+        </w:rPr>
+        <w:t xml:space="preserve">HTTP / PRINT RESPONSE HEADERS  </w:t>
+      </w:r>
+    </w:p>
+    <w:tbl>
+      <w:tblPr>
+        <w:tblW w:type="auto" w:w="0"/>
+        <w:jc w:val="center"/>
+        <w:tblLook w:firstColumn="1" w:firstRow="1" w:lastColumn="0" w:lastRow="0" w:noHBand="0" w:noVBand="1" w:val="04A0"/>
+      </w:tblPr>
+      <w:tblGrid>
+        <w:gridCol w:w="10108"/>
+      </w:tblGrid>
+      <w:tr>
+        <w:tc>
+          <w:tcPr>
+            <w:tcW w:type="dxa" w:w="10108"/>
+            <w:shd w:fill="EEF5FA"/>
+            <w:tcMar>
+              <w:top w:w="55" w:type="dxa"/>
+              <w:start w:w="110" w:type="dxa"/>
+              <w:bottom w:w="55" w:type="dxa"/>
+              <w:end w:w="110" w:type="dxa"/>
+            </w:tcMar>
+          </w:tcPr>
+          <w:p>
+            <w:pPr>
+              <w:spacing w:before="0" w:after="0" w:line="240" w:lineRule="auto"/>
+            </w:pPr>
+            <w:r>
+              <w:rPr>
+                <w:rFonts w:ascii="DejaVu Sans Mono" w:hAnsi="DejaVu Sans Mono" w:eastAsia="DejaVu Sans Mono"/>
+                <w:b w:val="0"/>
+                <w:i w:val="0"/>
+                <w:color w:val="172E45"/>
+                <w:sz w:val="16"/>
+              </w:rPr>
+              <w:t>curl -sS -D - "https://YOUR-LAB-ID.web-security-academy.net/" -o /dev/null</w:t>
+            </w:r>
+          </w:p>
+        </w:tc>
+      </w:tr>
+    </w:tbl>
+    <w:p>
+      <w:pPr>
+        <w:spacing w:before="0" w:after="60" w:line="240" w:lineRule="auto"/>
+      </w:pPr>
+      <w:r>
+        <w:rPr>
+          <w:rFonts w:ascii="Comic Neue" w:hAnsi="Comic Neue" w:eastAsia="Comic Neue"/>
+          <w:b w:val="0"/>
+          <w:i/>
+          <w:color w:val="5D6E80"/>
+          <w:sz w:val="17"/>
+        </w:rPr>
+        <w:t>Use the generated lab ID from the active training instance, not the documentation hostname.</w:t>
+      </w:r>
+    </w:p>
+    <w:p>
+      <w:pPr>
+        <w:keepNext/>
+        <w:spacing w:before="60" w:after="0" w:line="240" w:lineRule="auto"/>
+      </w:pPr>
+      <w:r>
+        <w:rPr>
+          <w:rFonts w:ascii="Comic Neue" w:hAnsi="Comic Neue" w:eastAsia="Comic Neue"/>
+          <w:b/>
+          <w:i w:val="0"/>
+          <w:color w:val="007B89"/>
+          <w:sz w:val="16"/>
+        </w:rPr>
+        <w:t xml:space="preserve">WINDOWS / EQUIVALENT  </w:t>
+      </w:r>
+    </w:p>
+    <w:tbl>
+      <w:tblPr>
+        <w:tblW w:type="auto" w:w="0"/>
+        <w:jc w:val="center"/>
+        <w:tblLook w:firstColumn="1" w:firstRow="1" w:lastColumn="0" w:lastRow="0" w:noHBand="0" w:noVBand="1" w:val="04A0"/>
+      </w:tblPr>
+      <w:tblGrid>
+        <w:gridCol w:w="10108"/>
+      </w:tblGrid>
+      <w:tr>
+        <w:tc>
+          <w:tcPr>
+            <w:tcW w:type="dxa" w:w="10108"/>
+            <w:shd w:fill="EEF5FA"/>
+            <w:tcMar>
+              <w:top w:w="55" w:type="dxa"/>
+              <w:start w:w="110" w:type="dxa"/>
+              <w:bottom w:w="55" w:type="dxa"/>
+              <w:end w:w="110" w:type="dxa"/>
+            </w:tcMar>
+          </w:tcPr>
+          <w:p>
+            <w:pPr>
+              <w:spacing w:before="0" w:after="0" w:line="240" w:lineRule="auto"/>
+            </w:pPr>
+            <w:r>
+              <w:rPr>
+                <w:rFonts w:ascii="DejaVu Sans Mono" w:hAnsi="DejaVu Sans Mono" w:eastAsia="DejaVu Sans Mono"/>
+                <w:b w:val="0"/>
+                <w:i w:val="0"/>
+                <w:color w:val="172E45"/>
+                <w:sz w:val="16"/>
+              </w:rPr>
+              <w:t>curl.exe -sS -D - "https://YOUR-LAB-ID.web-security-academy.net/" -o NUL</w:t>
+            </w:r>
+          </w:p>
+        </w:tc>
+      </w:tr>
+    </w:tbl>
+    <w:p>
+      <w:pPr>
+        <w:spacing w:before="0" w:after="60" w:line="240" w:lineRule="auto"/>
+      </w:pPr>
+      <w:r>
+        <w:rPr>
+          <w:rFonts w:ascii="Comic Neue" w:hAnsi="Comic Neue" w:eastAsia="Comic Neue"/>
+          <w:b w:val="0"/>
+          <w:i/>
+          <w:color w:val="5D6E80"/>
+          <w:sz w:val="17"/>
+        </w:rPr>
+        <w:t>Windows uses NUL as the output sink; use only the currently launched practice host.</w:t>
+      </w:r>
+    </w:p>
+    <w:p>
+      <w:pPr>
+        <w:keepNext/>
+        <w:spacing w:before="60" w:after="0" w:line="240" w:lineRule="auto"/>
+      </w:pPr>
+      <w:r>
+        <w:rPr>
+          <w:rFonts w:ascii="Comic Neue" w:hAnsi="Comic Neue" w:eastAsia="Comic Neue"/>
+          <w:b/>
+          <w:i w:val="0"/>
+          <w:color w:val="007B89"/>
+          <w:sz w:val="16"/>
+        </w:rPr>
+        <w:t xml:space="preserve">VERBOSE CONNECTION VIEW  </w:t>
+      </w:r>
+    </w:p>
+    <w:tbl>
+      <w:tblPr>
+        <w:tblW w:type="auto" w:w="0"/>
+        <w:jc w:val="center"/>
+        <w:tblLook w:firstColumn="1" w:firstRow="1" w:lastColumn="0" w:lastRow="0" w:noHBand="0" w:noVBand="1" w:val="04A0"/>
+      </w:tblPr>
+      <w:tblGrid>
+        <w:gridCol w:w="10108"/>
+      </w:tblGrid>
+      <w:tr>
+        <w:tc>
+          <w:tcPr>
+            <w:tcW w:type="dxa" w:w="10108"/>
+            <w:shd w:fill="EEF5FA"/>
+            <w:tcMar>
+              <w:top w:w="55" w:type="dxa"/>
+              <w:start w:w="110" w:type="dxa"/>
+              <w:bottom w:w="55" w:type="dxa"/>
+              <w:end w:w="110" w:type="dxa"/>
+            </w:tcMar>
+          </w:tcPr>
+          <w:p>
+            <w:pPr>
+              <w:spacing w:before="0" w:after="0" w:line="240" w:lineRule="auto"/>
+            </w:pPr>
+            <w:r>
+              <w:rPr>
+                <w:rFonts w:ascii="DejaVu Sans Mono" w:hAnsi="DejaVu Sans Mono" w:eastAsia="DejaVu Sans Mono"/>
+                <w:b w:val="0"/>
+                <w:i w:val="0"/>
+                <w:color w:val="172E45"/>
+                <w:sz w:val="16"/>
+              </w:rPr>
+              <w:t>curl -v "https://YOUR-LAB-ID.web-security-academy.net/" -o /dev/null</w:t>
+            </w:r>
+          </w:p>
+        </w:tc>
+      </w:tr>
+    </w:tbl>
+    <w:p>
+      <w:pPr>
+        <w:spacing w:before="0" w:after="60" w:line="240" w:lineRule="auto"/>
+      </w:pPr>
+      <w:r>
+        <w:rPr>
+          <w:rFonts w:ascii="Comic Neue" w:hAnsi="Comic Neue" w:eastAsia="Comic Neue"/>
+          <w:b w:val="0"/>
+          <w:i/>
+          <w:color w:val="5D6E80"/>
+          <w:sz w:val="17"/>
+        </w:rPr>
+        <w:t>Use verbose output only in the isolated lab and never share cookies, Authorization headers, or tokens.</w:t>
+      </w:r>
+    </w:p>
+    <w:p>
+      <w:pPr>
+        <w:keepNext/>
+        <w:spacing w:before="60" w:after="0" w:line="240" w:lineRule="auto"/>
+      </w:pPr>
+      <w:r>
+        <w:rPr>
+          <w:rFonts w:ascii="Comic Neue" w:hAnsi="Comic Neue" w:eastAsia="Comic Neue"/>
+          <w:b/>
+          <w:i w:val="0"/>
+          <w:color w:val="007B89"/>
+          <w:sz w:val="16"/>
+        </w:rPr>
+        <w:t xml:space="preserve">WIRESHARK DISPLAY FILTER  </w:t>
+      </w:r>
+    </w:p>
+    <w:tbl>
+      <w:tblPr>
+        <w:tblW w:type="auto" w:w="0"/>
+        <w:jc w:val="center"/>
+        <w:tblLook w:firstColumn="1" w:firstRow="1" w:lastColumn="0" w:lastRow="0" w:noHBand="0" w:noVBand="1" w:val="04A0"/>
+      </w:tblPr>
+      <w:tblGrid>
+        <w:gridCol w:w="10108"/>
+      </w:tblGrid>
+      <w:tr>
+        <w:tc>
+          <w:tcPr>
+            <w:tcW w:type="dxa" w:w="10108"/>
+            <w:shd w:fill="EEF5FA"/>
+            <w:tcMar>
+              <w:top w:w="55" w:type="dxa"/>
+              <w:start w:w="110" w:type="dxa"/>
+              <w:bottom w:w="55" w:type="dxa"/>
+              <w:end w:w="110" w:type="dxa"/>
+            </w:tcMar>
+          </w:tcPr>
+          <w:p>
+            <w:pPr>
+              <w:spacing w:before="0" w:after="0" w:line="240" w:lineRule="auto"/>
+            </w:pPr>
+            <w:r>
+              <w:rPr>
+                <w:rFonts w:ascii="DejaVu Sans Mono" w:hAnsi="DejaVu Sans Mono" w:eastAsia="DejaVu Sans Mono"/>
+                <w:b w:val="0"/>
+                <w:i w:val="0"/>
+                <w:color w:val="172E45"/>
+                <w:sz w:val="16"/>
+              </w:rPr>
+              <w:t>http || tls</w:t>
+            </w:r>
+          </w:p>
+        </w:tc>
+      </w:tr>
+    </w:tbl>
+    <w:p>
+      <w:pPr>
+        <w:spacing w:before="0" w:after="60" w:line="240" w:lineRule="auto"/>
+      </w:pPr>
+      <w:r>
+        <w:rPr>
+          <w:rFonts w:ascii="Comic Neue" w:hAnsi="Comic Neue" w:eastAsia="Comic Neue"/>
+          <w:b w:val="0"/>
+          <w:i/>
+          <w:color w:val="5D6E80"/>
+          <w:sz w:val="17"/>
+        </w:rPr>
+        <w:t>Use filters on provider-supplied capture files. HTTPS application payloads are not normally readable without authorised decryption material.</w:t>
+      </w:r>
+    </w:p>
+    <w:p>
+      <w:pPr>
+        <w:keepNext/>
+        <w:spacing w:before="60" w:after="0" w:line="240" w:lineRule="auto"/>
+      </w:pPr>
+      <w:r>
+        <w:rPr>
+          <w:rFonts w:ascii="Comic Neue" w:hAnsi="Comic Neue" w:eastAsia="Comic Neue"/>
+          <w:b/>
+          <w:i w:val="0"/>
+          <w:color w:val="007B89"/>
+          <w:sz w:val="16"/>
+        </w:rPr>
+        <w:t xml:space="preserve">TSHARK FIELD VIEW  </w:t>
+      </w:r>
+    </w:p>
+    <w:tbl>
+      <w:tblPr>
+        <w:tblW w:type="auto" w:w="0"/>
+        <w:jc w:val="center"/>
+        <w:tblLook w:firstColumn="1" w:firstRow="1" w:lastColumn="0" w:lastRow="0" w:noHBand="0" w:noVBand="1" w:val="04A0"/>
+      </w:tblPr>
+      <w:tblGrid>
+        <w:gridCol w:w="10108"/>
+      </w:tblGrid>
+      <w:tr>
+        <w:tc>
+          <w:tcPr>
+            <w:tcW w:type="dxa" w:w="10108"/>
+            <w:shd w:fill="EEF5FA"/>
+            <w:tcMar>
+              <w:top w:w="55" w:type="dxa"/>
+              <w:start w:w="110" w:type="dxa"/>
+              <w:bottom w:w="55" w:type="dxa"/>
+              <w:end w:w="110" w:type="dxa"/>
+            </w:tcMar>
+          </w:tcPr>
+          <w:p>
+            <w:pPr>
+              <w:spacing w:before="0" w:after="0" w:line="240" w:lineRule="auto"/>
+            </w:pPr>
+            <w:r>
+              <w:rPr>
+                <w:rFonts w:ascii="DejaVu Sans Mono" w:hAnsi="DejaVu Sans Mono" w:eastAsia="DejaVu Sans Mono"/>
+                <w:b w:val="0"/>
+                <w:i w:val="0"/>
+                <w:color w:val="172E45"/>
+                <w:sz w:val="16"/>
+              </w:rPr>
+              <w:t>tshark -r .\Exercise.pcapng -Y http.request -T fields -e frame.time -e ip.src -e http.request.method -e http.host -e http.request.uri</w:t>
+            </w:r>
+          </w:p>
+        </w:tc>
+      </w:tr>
+    </w:tbl>
+    <w:p>
+      <w:pPr>
+        <w:spacing w:before="0" w:after="60" w:line="240" w:lineRule="auto"/>
+      </w:pPr>
+      <w:r>
+        <w:rPr>
+          <w:rFonts w:ascii="Comic Neue" w:hAnsi="Comic Neue" w:eastAsia="Comic Neue"/>
+          <w:b w:val="0"/>
+          <w:i/>
+          <w:color w:val="5D6E80"/>
+          <w:sz w:val="17"/>
+        </w:rPr>
+        <w:t>Run only against the packet capture supplied by the course; replace the filename to match the lab file.</w:t>
+      </w:r>
+    </w:p>
+    <w:tbl>
+      <w:tblPr>
+        <w:tblW w:type="auto" w:w="0"/>
+        <w:jc w:val="center"/>
+        <w:tblLayout w:type="autofit"/>
+        <w:tblLook w:firstColumn="1" w:firstRow="1" w:lastColumn="0" w:lastRow="0" w:noHBand="0" w:noVBand="1" w:val="04A0"/>
+      </w:tblPr>
+      <w:tblGrid>
+        <w:gridCol w:w="10108"/>
+      </w:tblGrid>
+      <w:tr>
+        <w:tc>
+          <w:tcPr>
+            <w:tcW w:type="dxa" w:w="10108"/>
+            <w:shd w:fill="E4F0FF"/>
+            <w:tcMar>
+              <w:top w:w="90" w:type="dxa"/>
+              <w:start w:w="150" w:type="dxa"/>
+              <w:bottom w:w="90" w:type="dxa"/>
+              <w:end w:w="150" w:type="dxa"/>
+            </w:tcMar>
+          </w:tcPr>
+          <w:p>
+            <w:pPr>
+              <w:spacing w:before="0" w:after="0" w:line="240" w:lineRule="auto"/>
+            </w:pPr>
+            <w:r>
+              <w:rPr>
+                <w:rFonts w:ascii="Comic Neue" w:hAnsi="Comic Neue" w:eastAsia="Comic Neue"/>
+                <w:b/>
+                <w:i/>
+                <w:color w:val="275D9B"/>
+                <w:sz w:val="18"/>
+              </w:rPr>
+              <w:t xml:space="preserve">COMMAND HABIT  </w:t>
+            </w:r>
+            <w:r>
+              <w:rPr>
+                <w:rFonts w:ascii="Comic Neue" w:hAnsi="Comic Neue" w:eastAsia="Comic Neue"/>
+                <w:b w:val="0"/>
+                <w:i w:val="0"/>
+                <w:color w:val="2F3E50"/>
+                <w:sz w:val="18"/>
+              </w:rPr>
+              <w:t>Check the current working directory, shell, target, and expected effect before pressing Enter. Save the exact command and the output that mattered.</w:t>
+            </w:r>
+          </w:p>
+        </w:tc>
+      </w:tr>
+    </w:tbl>
+    <w:p>
+      <w:pPr>
+        <w:spacing w:after="0"/>
+      </w:pPr>
+    </w:p>
+    <w:p>
+      <w:pPr>
+        <w:pageBreakBefore/>
+        <w:spacing w:before="0" w:after="20" w:line="240" w:lineRule="auto"/>
+        <w:jc w:val="right"/>
+      </w:pPr>
+      <w:r>
+        <w:rPr>
+          <w:rFonts w:ascii="Comic Neue" w:hAnsi="Comic Neue" w:eastAsia="Comic Neue"/>
+          <w:b/>
+          <w:i/>
+          <w:color w:val="688097"/>
+          <w:sz w:val="15"/>
+        </w:rPr>
+        <w:t>RUN THE EXERCISE - RECORD WHAT THE EVIDENCE REALLY SHOWS</w:t>
+      </w:r>
+    </w:p>
+    <w:p>
+      <w:pPr>
+        <w:keepNext/>
+        <w:spacing w:before="100" w:after="80" w:line="240" w:lineRule="auto"/>
+      </w:pPr>
+      <w:r>
+        <w:rPr>
+          <w:rFonts w:ascii="Comic Neue" w:hAnsi="Comic Neue" w:eastAsia="Comic Neue"/>
+          <w:b/>
+          <w:i/>
+          <w:color w:val="087F8C"/>
+          <w:sz w:val="34"/>
+        </w:rPr>
+        <w:t>Guided lab run</w:t>
+      </w:r>
+    </w:p>
+    <w:p>
+      <w:pPr>
+        <w:pStyle w:val="ListBullet"/>
+        <w:spacing w:before="0" w:after="40" w:line="240" w:lineRule="auto"/>
+      </w:pPr>
+      <w:r>
+        <w:rPr>
+          <w:rFonts w:ascii="Comic Neue" w:hAnsi="Comic Neue" w:eastAsia="Comic Neue"/>
+          <w:b w:val="0"/>
+          <w:i w:val="0"/>
+          <w:color w:val="283A50"/>
+          <w:sz w:val="19"/>
+        </w:rPr>
+        <w:t>1. Open the HTTP room and launch the provided website exercise.</w:t>
+      </w:r>
+    </w:p>
+    <w:p>
+      <w:pPr>
+        <w:pStyle w:val="ListBullet"/>
+        <w:spacing w:before="0" w:after="40" w:line="240" w:lineRule="auto"/>
+      </w:pPr>
+      <w:r>
+        <w:rPr>
+          <w:rFonts w:ascii="Comic Neue" w:hAnsi="Comic Neue" w:eastAsia="Comic Neue"/>
+          <w:b w:val="0"/>
+          <w:i w:val="0"/>
+          <w:color w:val="283A50"/>
+          <w:sz w:val="19"/>
+        </w:rPr>
+        <w:t>2. Identify request method, hostname, path, and any query parameters.</w:t>
+      </w:r>
+    </w:p>
+    <w:p>
+      <w:pPr>
+        <w:pStyle w:val="ListBullet"/>
+        <w:spacing w:before="0" w:after="40" w:line="240" w:lineRule="auto"/>
+      </w:pPr>
+      <w:r>
+        <w:rPr>
+          <w:rFonts w:ascii="Comic Neue" w:hAnsi="Comic Neue" w:eastAsia="Comic Neue"/>
+          <w:b w:val="0"/>
+          <w:i w:val="0"/>
+          <w:color w:val="283A50"/>
+          <w:sz w:val="19"/>
+        </w:rPr>
+        <w:t>3. Record the response code, content type, redirect location (if any), and security headers relevant to the learning objective.</w:t>
+      </w:r>
+    </w:p>
+    <w:p>
+      <w:pPr>
+        <w:pStyle w:val="ListBullet"/>
+        <w:spacing w:before="0" w:after="40" w:line="240" w:lineRule="auto"/>
+      </w:pPr>
+      <w:r>
+        <w:rPr>
+          <w:rFonts w:ascii="Comic Neue" w:hAnsi="Comic Neue" w:eastAsia="Comic Neue"/>
+          <w:b w:val="0"/>
+          <w:i w:val="0"/>
+          <w:color w:val="283A50"/>
+          <w:sz w:val="19"/>
+        </w:rPr>
+        <w:t>4. If working with a capture, note frame number/time and distinguish HTTP from encrypted TLS traffic.</w:t>
+      </w:r>
+    </w:p>
+    <w:p>
+      <w:pPr>
+        <w:pStyle w:val="ListBullet"/>
+        <w:spacing w:before="0" w:after="40" w:line="240" w:lineRule="auto"/>
+      </w:pPr>
+      <w:r>
+        <w:rPr>
+          <w:rFonts w:ascii="Comic Neue" w:hAnsi="Comic Neue" w:eastAsia="Comic Neue"/>
+          <w:b w:val="0"/>
+          <w:i w:val="0"/>
+          <w:color w:val="283A50"/>
+          <w:sz w:val="19"/>
+        </w:rPr>
+        <w:t>5. Write a plain-language observation; do not label a response as vulnerable without evidence tied to the objective.</w:t>
+      </w:r>
+    </w:p>
+    <w:p>
+      <w:pPr>
+        <w:keepNext/>
+        <w:spacing w:before="40" w:after="80" w:line="240" w:lineRule="auto"/>
+      </w:pPr>
+      <w:r>
+        <w:rPr>
+          <w:rFonts w:ascii="Comic Neue" w:hAnsi="Comic Neue" w:eastAsia="Comic Neue"/>
+          <w:b/>
+          <w:i/>
+          <w:color w:val="B34778"/>
+          <w:sz w:val="25"/>
+        </w:rPr>
+        <w:t>Evidence checklist</w:t>
+      </w:r>
+    </w:p>
+    <w:p>
+      <w:pPr>
+        <w:pStyle w:val="ListBullet"/>
+        <w:spacing w:before="0" w:after="40" w:line="240" w:lineRule="auto"/>
+      </w:pPr>
+      <w:r>
+        <w:rPr>
+          <w:rFonts w:ascii="Comic Neue" w:hAnsi="Comic Neue" w:eastAsia="Comic Neue"/>
+          <w:b w:val="0"/>
+          <w:i w:val="0"/>
+          <w:color w:val="283A50"/>
+          <w:sz w:val="19"/>
+        </w:rPr>
+        <w:t>[ ] What exact lab instance or sample file was used?</w:t>
+      </w:r>
+    </w:p>
+    <w:p>
+      <w:pPr>
+        <w:pStyle w:val="ListBullet"/>
+        <w:spacing w:before="0" w:after="40" w:line="240" w:lineRule="auto"/>
+      </w:pPr>
+      <w:r>
+        <w:rPr>
+          <w:rFonts w:ascii="Comic Neue" w:hAnsi="Comic Neue" w:eastAsia="Comic Neue"/>
+          <w:b w:val="0"/>
+          <w:i w:val="0"/>
+          <w:color w:val="283A50"/>
+          <w:sz w:val="19"/>
+        </w:rPr>
+        <w:t>[ ] Which command/query and time range produced the observation?</w:t>
+      </w:r>
+    </w:p>
+    <w:p>
+      <w:pPr>
+        <w:pStyle w:val="ListBullet"/>
+        <w:spacing w:before="0" w:after="40" w:line="240" w:lineRule="auto"/>
+      </w:pPr>
+      <w:r>
+        <w:rPr>
+          <w:rFonts w:ascii="Comic Neue" w:hAnsi="Comic Neue" w:eastAsia="Comic Neue"/>
+          <w:b w:val="0"/>
+          <w:i w:val="0"/>
+          <w:color w:val="283A50"/>
+          <w:sz w:val="19"/>
+        </w:rPr>
+        <w:t>[ ] What is the directly observed fact, separate from your inference?</w:t>
+      </w:r>
+    </w:p>
+    <w:p>
+      <w:pPr>
+        <w:pStyle w:val="ListBullet"/>
+        <w:spacing w:before="0" w:after="40" w:line="240" w:lineRule="auto"/>
+      </w:pPr>
+      <w:r>
+        <w:rPr>
+          <w:rFonts w:ascii="Comic Neue" w:hAnsi="Comic Neue" w:eastAsia="Comic Neue"/>
+          <w:b w:val="0"/>
+          <w:i w:val="0"/>
+          <w:color w:val="283A50"/>
+          <w:sz w:val="19"/>
+        </w:rPr>
+        <w:t>[ ] What benign/alternative explanation could fit?</w:t>
+      </w:r>
+    </w:p>
+    <w:p>
+      <w:pPr>
+        <w:pStyle w:val="ListBullet"/>
+        <w:spacing w:before="0" w:after="40" w:line="240" w:lineRule="auto"/>
+      </w:pPr>
+      <w:r>
+        <w:rPr>
+          <w:rFonts w:ascii="Comic Neue" w:hAnsi="Comic Neue" w:eastAsia="Comic Neue"/>
+          <w:b w:val="0"/>
+          <w:i w:val="0"/>
+          <w:color w:val="283A50"/>
+          <w:sz w:val="19"/>
+        </w:rPr>
+        <w:t>[ ] What extra record or control would help confirm the conclusion?</w:t>
+      </w:r>
+    </w:p>
+    <w:p>
+      <w:pPr>
+        <w:keepNext/>
+        <w:spacing w:before="40" w:after="80" w:line="240" w:lineRule="auto"/>
+      </w:pPr>
+      <w:r>
+        <w:rPr>
+          <w:rFonts w:ascii="Comic Neue" w:hAnsi="Comic Neue" w:eastAsia="Comic Neue"/>
+          <w:b/>
+          <w:i/>
+          <w:color w:val="B34778"/>
+          <w:sz w:val="25"/>
+        </w:rPr>
+        <w:t>Check your understanding</w:t>
+      </w:r>
+    </w:p>
+    <w:p>
+      <w:pPr>
+        <w:keepNext/>
+        <w:spacing w:before="40" w:after="20" w:line="240" w:lineRule="auto"/>
+      </w:pPr>
+      <w:r>
+        <w:rPr>
+          <w:rFonts w:ascii="Comic Neue" w:hAnsi="Comic Neue" w:eastAsia="Comic Neue"/>
+          <w:b/>
+          <w:i/>
+          <w:color w:val="B34778"/>
+          <w:sz w:val="19"/>
+        </w:rPr>
+        <w:t>Q  Why should a report redact cookies?</w:t>
+      </w:r>
+    </w:p>
+    <w:p>
+      <w:pPr>
+        <w:spacing w:before="0" w:after="60" w:line="240" w:lineRule="auto"/>
+      </w:pPr>
+      <w:r>
+        <w:rPr>
+          <w:rFonts w:ascii="Comic Neue" w:hAnsi="Comic Neue" w:eastAsia="Comic Neue"/>
+          <w:b w:val="0"/>
+          <w:i w:val="0"/>
+          <w:color w:val="263D52"/>
+          <w:sz w:val="18"/>
+        </w:rPr>
+        <w:t>Think it through: Session cookies can grant account access; they are secrets, not harmless evidence.</w:t>
+      </w:r>
+    </w:p>
+    <w:p>
+      <w:pPr>
+        <w:keepNext/>
+        <w:spacing w:before="40" w:after="20" w:line="240" w:lineRule="auto"/>
+      </w:pPr>
+      <w:r>
+        <w:rPr>
+          <w:rFonts w:ascii="Comic Neue" w:hAnsi="Comic Neue" w:eastAsia="Comic Neue"/>
+          <w:b/>
+          <w:i/>
+          <w:color w:val="B34778"/>
+          <w:sz w:val="19"/>
+        </w:rPr>
+        <w:t>Q  Does a 403 response alone prove the access-control design is secure?</w:t>
+      </w:r>
+    </w:p>
+    <w:p>
+      <w:pPr>
+        <w:spacing w:before="0" w:after="60" w:line="240" w:lineRule="auto"/>
+      </w:pPr>
+      <w:r>
+        <w:rPr>
+          <w:rFonts w:ascii="Comic Neue" w:hAnsi="Comic Neue" w:eastAsia="Comic Neue"/>
+          <w:b w:val="0"/>
+          <w:i w:val="0"/>
+          <w:color w:val="263D52"/>
+          <w:sz w:val="18"/>
+        </w:rPr>
+        <w:t>Think it through: No. It is one observed response in one context; test expectations must match the defined lab task.</w:t>
+      </w:r>
+    </w:p>
+    <w:p>
+      <w:pPr>
+        <w:keepNext/>
+        <w:spacing w:before="40" w:after="20" w:line="240" w:lineRule="auto"/>
+      </w:pPr>
+      <w:r>
+        <w:rPr>
+          <w:rFonts w:ascii="Comic Neue" w:hAnsi="Comic Neue" w:eastAsia="Comic Neue"/>
+          <w:b/>
+          <w:i/>
+          <w:color w:val="B34778"/>
+          <w:sz w:val="19"/>
+        </w:rPr>
+        <w:t>Q  What should be captured for reproducibility?</w:t>
+      </w:r>
+    </w:p>
+    <w:p>
+      <w:pPr>
+        <w:spacing w:before="0" w:after="60" w:line="240" w:lineRule="auto"/>
+      </w:pPr>
+      <w:r>
+        <w:rPr>
+          <w:rFonts w:ascii="Comic Neue" w:hAnsi="Comic Neue" w:eastAsia="Comic Neue"/>
+          <w:b w:val="0"/>
+          <w:i w:val="0"/>
+          <w:color w:val="263D52"/>
+          <w:sz w:val="18"/>
+        </w:rPr>
+        <w:t>Think it through: Exact lab instance, request method/path, timestamp, status, relevant redacted headers, and response behaviour.</w:t>
+      </w:r>
+    </w:p>
+    <w:tbl>
+      <w:tblPr>
+        <w:tblW w:type="auto" w:w="0"/>
+        <w:jc w:val="center"/>
+        <w:tblLayout w:type="autofit"/>
+        <w:tblLook w:firstColumn="1" w:firstRow="1" w:lastColumn="0" w:lastRow="0" w:noHBand="0" w:noVBand="1" w:val="04A0"/>
+      </w:tblPr>
+      <w:tblGrid>
+        <w:gridCol w:w="10108"/>
+      </w:tblGrid>
+      <w:tr>
+        <w:tc>
+          <w:tcPr>
+            <w:tcW w:type="dxa" w:w="10108"/>
+            <w:shd w:fill="FFF1C9"/>
+            <w:tcMar>
+              <w:top w:w="90" w:type="dxa"/>
+              <w:start w:w="150" w:type="dxa"/>
+              <w:bottom w:w="90" w:type="dxa"/>
+              <w:end w:w="150" w:type="dxa"/>
+            </w:tcMar>
+          </w:tcPr>
+          <w:p>
+            <w:pPr>
+              <w:spacing w:before="0" w:after="0" w:line="240" w:lineRule="auto"/>
+            </w:pPr>
+            <w:r>
+              <w:rPr>
+                <w:rFonts w:ascii="Comic Neue" w:hAnsi="Comic Neue" w:eastAsia="Comic Neue"/>
+                <w:b/>
+                <w:i/>
+                <w:color w:val="8A5A00"/>
+                <w:sz w:val="18"/>
+              </w:rPr>
+              <w:t xml:space="preserve">NOTEBOOK CLOSE-OUT  </w:t>
+            </w:r>
+            <w:r>
+              <w:rPr>
+                <w:rFonts w:ascii="Comic Neue" w:hAnsi="Comic Neue" w:eastAsia="Comic Neue"/>
+                <w:b w:val="0"/>
+                <w:i w:val="0"/>
+                <w:color w:val="2F3E50"/>
+                <w:sz w:val="18"/>
+              </w:rPr>
+              <w:t>Finish with: Observation / Evidence source / Why it matters / Alternative explanation / Next check / Limitation. A careful “not enough evidence yet” is a valid professional result.</w:t>
+            </w:r>
+          </w:p>
+        </w:tc>
+      </w:tr>
+    </w:tbl>
+    <w:p>
+      <w:pPr>
+        <w:spacing w:after="0"/>
+      </w:pPr>
+    </w:p>
     <w:sectPr>
       <w:headerReference w:type="default" r:id="rId9"/>
       <w:footerReference w:type="default" r:id="rId10"/>

</xml_diff>